<commit_message>
Refactor business rules for booking, dispute resolution, fleet management, inspections, promotions, and documentation updates
- Updated booking rules to clarify vehicle availability checks and booking modes.
- Revised dispute handling to focus on incident resolution and evidence requirements.
- Adjusted fleet management rules to specify staff operational limits and BYOC policies.
- Enhanced inspection rules to align with session-based processes and evidence collection.
- Modified promotions rules to reflect changes in applicable booking modes and staff permissions.
- General documentation updates for clarity and consistency across business rules.
</commit_message>
<xml_diff>
--- a/docs/docs/RCField_Overview-V1.0.0.docx
+++ b/docs/docs/RCField_Overview-V1.0.0.docx
@@ -7,7 +7,8 @@
         <w:spacing w:after="0" w:before="320"/>
       </w:pPr>
       <w:r>
-        <w:t xml:space="preserve"/>
+        <w:t xml:space="preserve">
+        </w:t>
       </w:r>
     </w:p>
     <w:p>
@@ -50,7 +51,8 @@
         <w:spacing w:after="0" w:before="80"/>
       </w:pPr>
       <w:r>
-        <w:t xml:space="preserve"/>
+        <w:t xml:space="preserve">
+        </w:t>
       </w:r>
     </w:p>
     <w:p>
@@ -88,7 +90,7 @@
           <w:sz w:val="28"/>
           <w:szCs w:val="28"/>
         </w:rPr>
-        <w:t xml:space="preserve">RC Cafe Operations &amp; Marketplace Platform</w:t>
+        <w:t xml:space="preserve">RC Cafe Operations &amp; Booking Platform</w:t>
       </w:r>
     </w:p>
     <w:p>
@@ -105,7 +107,7 @@
           <w:sz w:val="24"/>
           <w:szCs w:val="24"/>
         </w:rPr>
-        <w:t xml:space="preserve">Nền tảng Số hóa Vận hành và Kết nối Cafe Xe RC</w:t>
+        <w:t xml:space="preserve">Nền tảng Số hóa Vận hành và Đặt lịch Sân Xe RC</w:t>
       </w:r>
     </w:p>
     <w:p>
@@ -113,7 +115,8 @@
         <w:spacing w:after="0" w:before="240"/>
       </w:pPr>
       <w:r>
-        <w:t xml:space="preserve"/>
+        <w:t xml:space="preserve">
+        </w:t>
       </w:r>
     </w:p>
     <w:tbl>
@@ -411,7 +414,8 @@
         <w:spacing w:after="0" w:before="80"/>
       </w:pPr>
       <w:r>
-        <w:t xml:space="preserve"/>
+        <w:t xml:space="preserve">
+        </w:t>
       </w:r>
     </w:p>
     <w:p>
@@ -451,7 +455,8 @@
         <w:spacing w:after="0" w:before="80"/>
       </w:pPr>
       <w:r>
-        <w:t xml:space="preserve"/>
+        <w:t xml:space="preserve">
+        </w:t>
       </w:r>
     </w:p>
     <w:p>
@@ -497,7 +502,8 @@
         <w:spacing w:after="0" w:before="80"/>
       </w:pPr>
       <w:r>
-        <w:t xml:space="preserve"/>
+        <w:t xml:space="preserve">
+        </w:t>
       </w:r>
     </w:p>
     <w:p>
@@ -537,7 +543,8 @@
         <w:spacing w:after="0" w:before="80"/>
       </w:pPr>
       <w:r>
-        <w:t xml:space="preserve"/>
+        <w:t xml:space="preserve">
+        </w:t>
       </w:r>
     </w:p>
     <w:tbl>
@@ -1026,7 +1033,8 @@
         <w:spacing w:after="0" w:before="160"/>
       </w:pPr>
       <w:r>
-        <w:t xml:space="preserve"/>
+        <w:t xml:space="preserve">
+        </w:t>
       </w:r>
     </w:p>
     <w:p>
@@ -1054,7 +1062,8 @@
         <w:spacing w:after="0" w:before="80"/>
       </w:pPr>
       <w:r>
-        <w:t xml:space="preserve"/>
+        <w:t xml:space="preserve">
+        </w:t>
       </w:r>
     </w:p>
     <w:tbl>
@@ -1118,7 +1127,7 @@
                 <w:sz w:val="22"/>
                 <w:szCs w:val="22"/>
               </w:rPr>
-              <w:t xml:space="preserve">RCField là nền tảng SaaS dọc (Vertical SaaS) số hóa toàn bộ vận hành của cafe xe RC, kết nối chủ quán (Provider) với khách hàng thông qua quy trình được chuẩn hóa: đặt lịch, quản lý đội xe, bàn giao tài sản có bằng chứng số, thanh toán tự động, và giải quyết tranh chấp minh bạch.</w:t>
+              <w:t xml:space="preserve">RCField Phase 1 là Operational Core số hóa vận hành thật của cafe xe RC: đặt lịch, quản lý đội xe, BYOC, phiên chơi thực tế, F&amp;B, gói chơi, lịch định kỳ, giải đua, bàn giao tài sản bằng ảnh/checklist, xử lý sự cố theo policy, thanh toán component-based và trust score audit. Phase 2 tập trung vào staff/cafe operations nâng cao, dispute workflow nhiều bên, AI nâng cao và SaaS tenant/billing.</w:t>
             </w:r>
           </w:p>
         </w:tc>
@@ -1129,7 +1138,8 @@
         <w:spacing w:after="0" w:before="80"/>
       </w:pPr>
       <w:r>
-        <w:t xml:space="preserve"/>
+        <w:t xml:space="preserve">
+        </w:t>
       </w:r>
     </w:p>
     <w:p>
@@ -1154,7 +1164,8 @@
         <w:spacing w:after="0" w:before="80"/>
       </w:pPr>
       <w:r>
-        <w:t xml:space="preserve"/>
+        <w:t xml:space="preserve">
+        </w:t>
       </w:r>
     </w:p>
     <w:tbl>
@@ -1629,7 +1640,7 @@
                 <w:sz w:val="20"/>
                 <w:szCs w:val="20"/>
               </w:rPr>
-              <w:t xml:space="preserve">Phê duyệt quán, quản lý người dùng, xử lý tranh chấp, giám sát giao dịch</w:t>
+              <w:t xml:space="preserve">Phê duyệt quán, quản lý người dùng, giám sát incident/policy resolution, giám sát giao dịch</w:t>
             </w:r>
           </w:p>
         </w:tc>
@@ -1640,7 +1651,8 @@
         <w:spacing w:after="0" w:before="160"/>
       </w:pPr>
       <w:r>
-        <w:t xml:space="preserve"/>
+        <w:t xml:space="preserve">
+        </w:t>
       </w:r>
     </w:p>
     <w:p>
@@ -1668,7 +1680,8 @@
         <w:spacing w:after="0" w:before="80"/>
       </w:pPr>
       <w:r>
-        <w:t xml:space="preserve"/>
+        <w:t xml:space="preserve">
+        </w:t>
       </w:r>
     </w:p>
     <w:p>
@@ -1708,7 +1721,8 @@
         <w:spacing w:after="0" w:before="80"/>
       </w:pPr>
       <w:r>
-        <w:t xml:space="preserve"/>
+        <w:t xml:space="preserve">
+        </w:t>
       </w:r>
     </w:p>
     <w:tbl>
@@ -1993,7 +2007,8 @@
         <w:spacing w:after="0" w:before="80"/>
       </w:pPr>
       <w:r>
-        <w:t xml:space="preserve"/>
+        <w:t xml:space="preserve">
+        </w:t>
       </w:r>
     </w:p>
     <w:p>
@@ -2033,7 +2048,8 @@
         <w:spacing w:after="0" w:before="80"/>
       </w:pPr>
       <w:r>
-        <w:t xml:space="preserve"/>
+        <w:t xml:space="preserve">
+        </w:t>
       </w:r>
     </w:p>
     <w:tbl>
@@ -2588,7 +2604,8 @@
         <w:spacing w:after="0" w:before="80"/>
       </w:pPr>
       <w:r>
-        <w:t xml:space="preserve"/>
+        <w:t xml:space="preserve">
+        </w:t>
       </w:r>
     </w:p>
     <w:p>
@@ -2628,7 +2645,8 @@
         <w:spacing w:after="0" w:before="80"/>
       </w:pPr>
       <w:r>
-        <w:t xml:space="preserve"/>
+        <w:t xml:space="preserve">
+        </w:t>
       </w:r>
     </w:p>
     <w:p>
@@ -2731,7 +2749,8 @@
         <w:spacing w:after="0" w:before="80"/>
       </w:pPr>
       <w:r>
-        <w:t xml:space="preserve"/>
+        <w:t xml:space="preserve">
+        </w:t>
       </w:r>
     </w:p>
     <w:p>
@@ -2771,7 +2790,8 @@
         <w:spacing w:after="0" w:before="80"/>
       </w:pPr>
       <w:r>
-        <w:t xml:space="preserve"/>
+        <w:t xml:space="preserve">
+        </w:t>
       </w:r>
     </w:p>
     <w:p>
@@ -2811,7 +2831,8 @@
         <w:spacing w:after="0" w:before="80"/>
       </w:pPr>
       <w:r>
-        <w:t xml:space="preserve"/>
+        <w:t xml:space="preserve">
+        </w:t>
       </w:r>
     </w:p>
     <w:tbl>
@@ -3389,7 +3410,8 @@
         <w:spacing w:after="0" w:before="80"/>
       </w:pPr>
       <w:r>
-        <w:t xml:space="preserve"/>
+        <w:t xml:space="preserve">
+        </w:t>
       </w:r>
     </w:p>
     <w:p>
@@ -3406,7 +3428,7 @@
           <w:sz w:val="24"/>
           <w:szCs w:val="24"/>
         </w:rPr>
-        <w:t xml:space="preserve">3.6. Dispute Resolution – Giải quyết Tranh chấp</w:t>
+        <w:t xml:space="preserve">3.6. Roadmap Operational Core vs Phase 2</w:t>
       </w:r>
     </w:p>
     <w:p>
@@ -3421,7 +3443,7 @@
           <w:sz w:val="22"/>
           <w:szCs w:val="22"/>
         </w:rPr>
-        <w:t xml:space="preserve">Khi khách hoặc chủ quán không đồng ý với kết quả check-out, họ có thể mở dispute kèm bằng chứng. Admin xem xét toàn bộ hồ sơ số: ảnh check-in/out, checklist, lịch sử điểm trust của khách, và đưa ra phán quyết. Cơ chế pre-existing flag điều chỉnh trách nhiệm chứng minh khi có hư hỏng đã được ghi nhận từ trước.</w:t>
+        <w:t xml:space="preserve">Phase 1 giữ Operational Core khoảng 37 bảng: auth, cafe, vehicles, BYOC, bookings/sessions, F&amp;B, packages, subscriptions, contests, payment components, inspections, extension, promotions, incident policy resolution, reviews, notifications, trust score, maintenance logs và feature flags. Phase 2 gồm staff assignment, cafe closures/announcements, dispute workflow nhiều bên, SaaS tenant model, AI damage analysis, advanced analytics, loyalty và dynamic pricing.</w:t>
       </w:r>
     </w:p>
     <w:p>
@@ -3429,7 +3451,8 @@
         <w:spacing w:after="0" w:before="160"/>
       </w:pPr>
       <w:r>
-        <w:t xml:space="preserve"/>
+        <w:t xml:space="preserve">
+        </w:t>
       </w:r>
     </w:p>
     <w:p>
@@ -3457,7 +3480,8 @@
         <w:spacing w:after="0" w:before="80"/>
       </w:pPr>
       <w:r>
-        <w:t xml:space="preserve"/>
+        <w:t xml:space="preserve">
+        </w:t>
       </w:r>
     </w:p>
     <w:p>
@@ -3644,7 +3668,7 @@
                 <w:sz w:val="20"/>
                 <w:szCs w:val="20"/>
               </w:rPr>
-              <w:t xml:space="preserve">NestJS (Node.js)</w:t>
+              <w:t xml:space="preserve">Express.js (Node.js + TypeScript)</w:t>
             </w:r>
           </w:p>
         </w:tc>
@@ -3673,7 +3697,7 @@
                 <w:sz w:val="20"/>
                 <w:szCs w:val="20"/>
               </w:rPr>
-              <w:t xml:space="preserve">RESTful API, kiến trúc module, State Machine</w:t>
+              <w:t xml:space="preserve">RESTful API, router/service theo domain, Booking/Session State Machine</w:t>
             </w:r>
           </w:p>
         </w:tc>
@@ -3733,7 +3757,7 @@
                 <w:sz w:val="20"/>
                 <w:szCs w:val="20"/>
               </w:rPr>
-              <w:t xml:space="preserve">Web App (React/Next.js)</w:t>
+              <w:t xml:space="preserve">Web App (React + Vite)</w:t>
             </w:r>
           </w:p>
         </w:tc>
@@ -4118,7 +4142,7 @@
                 <w:sz w:val="20"/>
                 <w:szCs w:val="20"/>
               </w:rPr>
-              <w:t xml:space="preserve">5 nhóm actor với phân quyền riêng biệt</w:t>
+              <w:t xml:space="preserve">4 nhóm actor với phân quyền riêng biệt</w:t>
             </w:r>
           </w:p>
         </w:tc>
@@ -4129,7 +4153,8 @@
         <w:spacing w:after="0" w:before="80"/>
       </w:pPr>
       <w:r>
-        <w:t xml:space="preserve"/>
+        <w:t xml:space="preserve">
+        </w:t>
       </w:r>
     </w:p>
     <w:p>
@@ -4203,7 +4228,7 @@
           <w:sz w:val="22"/>
           <w:szCs w:val="22"/>
         </w:rPr>
-        <w:t xml:space="preserve">Bảo mật: RBAC cho 5 nhóm actor; mã hóa dữ liệu cá nhân và thanh toán; tích hợp VNPay theo chuẩn bảo mật.</w:t>
+        <w:t xml:space="preserve">Bảo mật: RBAC cho 4 nhóm actor; mã hóa dữ liệu cá nhân và thanh toán; tích hợp VNPay theo chuẩn bảo mật.</w:t>
       </w:r>
     </w:p>
     <w:p>
@@ -4222,7 +4247,7 @@
           <w:sz w:val="22"/>
           <w:szCs w:val="22"/>
         </w:rPr>
-        <w:t xml:space="preserve">Khả năng mở rộng: kiến trúc module NestJS thiết kế sẵn cho Phase 2 (tournament, marketplace, loyalty, dynamic pricing).</w:t>
+        <w:t xml:space="preserve">Khả năng mở rộng: kiến trúc Express module hóa, PostgreSQL schema Operational Core và feature flags cho Phase 2 (AI, SaaS tenant/billing, analytics nâng cao, loyalty, dynamic pricing).</w:t>
       </w:r>
     </w:p>
     <w:p>
@@ -4230,7 +4255,8 @@
         <w:spacing w:after="0" w:before="160"/>
       </w:pPr>
       <w:r>
-        <w:t xml:space="preserve"/>
+        <w:t xml:space="preserve">
+        </w:t>
       </w:r>
     </w:p>
     <w:p>
@@ -4258,7 +4284,8 @@
         <w:spacing w:after="0" w:before="80"/>
       </w:pPr>
       <w:r>
-        <w:t xml:space="preserve"/>
+        <w:t xml:space="preserve">
+        </w:t>
       </w:r>
     </w:p>
     <w:p>
@@ -4298,7 +4325,8 @@
         <w:spacing w:after="0" w:before="80"/>
       </w:pPr>
       <w:r>
-        <w:t xml:space="preserve"/>
+        <w:t xml:space="preserve">
+        </w:t>
       </w:r>
     </w:p>
     <w:tbl>
@@ -4468,7 +4496,7 @@
                 <w:sz w:val="20"/>
                 <w:szCs w:val="20"/>
               </w:rPr>
-              <w:t xml:space="preserve">Core Platform &amp; Booking</w:t>
+              <w:t xml:space="preserve">Core Platform &amp; Booking/Session</w:t>
             </w:r>
           </w:p>
         </w:tc>
@@ -4497,7 +4525,7 @@
                 <w:sz w:val="20"/>
                 <w:szCs w:val="20"/>
               </w:rPr>
-              <w:t xml:space="preserve">User management, RBAC, Provider onboarding, café listing, Browse &amp; Book (RENTAL/BYOC), Asset Risk Tier, State Machine lifecycle.</w:t>
+              <w:t xml:space="preserve">User management, RBAC, cafe listing, fleet/BYOC registry, Browse &amp; Book (RENTAL/BYOC/MIXED), planned participants/vehicles, booking/session lifecycle.</w:t>
             </w:r>
           </w:p>
         </w:tc>
@@ -4557,7 +4585,7 @@
                 <w:sz w:val="20"/>
                 <w:szCs w:val="20"/>
               </w:rPr>
-              <w:t xml:space="preserve">Inspection, Payment &amp; Evidence</w:t>
+              <w:t xml:space="preserve">Operations, Commerce &amp; Risk</w:t>
             </w:r>
           </w:p>
         </w:tc>
@@ -4586,7 +4614,7 @@
                 <w:sz w:val="20"/>
                 <w:szCs w:val="20"/>
               </w:rPr>
-              <w:t xml:space="preserve">Check-in/check-out module, photo capture, condition checklist, pre-existing flag, slot extension, Component-based Payment Engine, damage scoring, dispute resolution, Customer trust score.</w:t>
+              <w:t xml:space="preserve">Check-in/check-out, inspection photos, checklist, slot extension, Component-based Payment Engine, F&amp;B, packages, subscriptions, contests, promotions, incident policy resolution, maintenance logs, trust score audit.</w:t>
             </w:r>
           </w:p>
         </w:tc>
@@ -4646,7 +4674,7 @@
                 <w:sz w:val="20"/>
                 <w:szCs w:val="20"/>
               </w:rPr>
-              <w:t xml:space="preserve">Analytics, Testing &amp; Deployment</w:t>
+              <w:t xml:space="preserve">Testing, Deployment &amp; Docs</w:t>
             </w:r>
           </w:p>
         </w:tc>
@@ -4675,7 +4703,7 @@
                 <w:sz w:val="20"/>
                 <w:szCs w:val="20"/>
               </w:rPr>
-              <w:t xml:space="preserve">Provider analytics dashboard, full system testing (Unit/Integration/System/UAT), deployment môi trường demo, hoàn thiện tài liệu kỹ thuật.</w:t>
+              <w:t xml:space="preserve">Full system testing (Unit/Integration/System/UAT), deployment môi trường demo, hoàn thiện tài liệu kỹ thuật và Phase 2 AI/SaaS extension plan.</w:t>
             </w:r>
           </w:p>
         </w:tc>
@@ -4686,7 +4714,8 @@
         <w:spacing w:after="0" w:before="80"/>
       </w:pPr>
       <w:r>
-        <w:t xml:space="preserve"/>
+        <w:t xml:space="preserve">
+        </w:t>
       </w:r>
     </w:p>
     <w:p>
@@ -4863,7 +4892,8 @@
         <w:spacing w:after="0" w:before="160"/>
       </w:pPr>
       <w:r>
-        <w:t xml:space="preserve"/>
+        <w:t xml:space="preserve">
+        </w:t>
       </w:r>
     </w:p>
     <w:p>
@@ -4891,7 +4921,8 @@
         <w:spacing w:after="0" w:before="80"/>
       </w:pPr>
       <w:r>
-        <w:t xml:space="preserve"/>
+        <w:t xml:space="preserve">
+        </w:t>
       </w:r>
     </w:p>
     <w:p>
@@ -4923,7 +4954,7 @@
           <w:sz w:val="22"/>
           <w:szCs w:val="22"/>
         </w:rPr>
-        <w:t xml:space="preserve">Bộ RESTful API đầy đủ phục vụ toàn bộ quy trình nghiệp vụ: browse &amp; book, fleet management, check-in/check-out, slot extension, thanh toán, damage assessment, dispute handling, state machine lifecycle, và analytics.</w:t>
+        <w:t xml:space="preserve">Bộ RESTful API Operational Core phục vụ browse &amp; book, fleet/BYOC management, booking/session lifecycle, F&amp;B, packages, subscriptions, contests, check-in/check-out, slot extension, payment components, promotions, incident policy resolution, reviews, notifications và trust score audit.</w:t>
       </w:r>
     </w:p>
     <w:p>
@@ -4931,7 +4962,8 @@
         <w:spacing w:after="0" w:before="80"/>
       </w:pPr>
       <w:r>
-        <w:t xml:space="preserve"/>
+        <w:t xml:space="preserve">
+        </w:t>
       </w:r>
     </w:p>
     <w:p>
@@ -4986,7 +5018,7 @@
           <w:sz w:val="22"/>
           <w:szCs w:val="22"/>
         </w:rPr>
-        <w:t xml:space="preserve">Đặt lịch theo chế độ RENTAL hoặc BYOC; khai báo xe cho BYOC.</w:t>
+        <w:t xml:space="preserve">Đặt lịch theo chế độ RENTAL, BYOC hoặc MIXED; khai báo xe cho BYOC.</w:t>
       </w:r>
     </w:p>
     <w:p>
@@ -5043,7 +5075,7 @@
           <w:sz w:val="22"/>
           <w:szCs w:val="22"/>
         </w:rPr>
-        <w:t xml:space="preserve">Mở dispute kèm bằng chứng; đánh giá quán sau khi kết thúc phiên.</w:t>
+        <w:t xml:space="preserve">Xác nhận kết quả inspection, nhận thông báo, và đánh giá quán sau khi kết thúc phiên.</w:t>
       </w:r>
     </w:p>
     <w:p>
@@ -5051,7 +5083,8 @@
         <w:spacing w:after="0" w:before="80"/>
       </w:pPr>
       <w:r>
-        <w:t xml:space="preserve"/>
+        <w:t xml:space="preserve">
+        </w:t>
       </w:r>
     </w:p>
     <w:p>
@@ -5087,7 +5120,7 @@
           <w:sz w:val="22"/>
           <w:szCs w:val="22"/>
         </w:rPr>
-        <w:t xml:space="preserve">Quản lý hồ sơ quán, giá cả, mô tả đường đua, giờ mở cửa.</w:t>
+        <w:t xml:space="preserve">Quản lý hồ sơ quán, giá cả, loại track và giờ mở cửa. Staff assignment chi tiết chuyển sang Phase 2.</w:t>
       </w:r>
     </w:p>
     <w:p>
@@ -5163,7 +5196,7 @@
           <w:sz w:val="22"/>
           <w:szCs w:val="22"/>
         </w:rPr>
-        <w:t xml:space="preserve">Dashboard: phân tích doanh thu, tỷ lệ sử dụng đội xe, doanh thu theo xe.</w:t>
+        <w:t xml:space="preserve">Theo dõi lịch đặt, phiên chơi, trạng thái xe và lịch sử vận hành cốt lõi.</w:t>
       </w:r>
     </w:p>
     <w:p>
@@ -5171,7 +5204,8 @@
         <w:spacing w:after="0" w:before="80"/>
       </w:pPr>
       <w:r>
-        <w:t xml:space="preserve"/>
+        <w:t xml:space="preserve">
+        </w:t>
       </w:r>
     </w:p>
     <w:p>
@@ -5245,7 +5279,7 @@
           <w:sz w:val="22"/>
           <w:szCs w:val="22"/>
         </w:rPr>
-        <w:t xml:space="preserve">Xử lý dispute: xem xét bằng chứng số và ra quyết định giải quyết.</w:t>
+        <w:t xml:space="preserve">Quản lý feature flags, cấu hình hệ thống và giám sát dữ liệu vận hành cốt lõi.</w:t>
       </w:r>
     </w:p>
     <w:p>
@@ -5264,7 +5298,7 @@
           <w:sz w:val="22"/>
           <w:szCs w:val="22"/>
         </w:rPr>
-        <w:t xml:space="preserve">Giám sát giao dịch, thanh toán, và doanh thu toàn nền tảng.</w:t>
+        <w:t xml:space="preserve">Giám sát giao dịch, thanh toán và audit log toàn nền tảng.</w:t>
       </w:r>
     </w:p>
     <w:p>
@@ -5272,7 +5306,8 @@
         <w:spacing w:after="0" w:before="160"/>
       </w:pPr>
       <w:r>
-        <w:t xml:space="preserve"/>
+        <w:t xml:space="preserve">
+        </w:t>
       </w:r>
     </w:p>
     <w:p>
@@ -5285,7 +5320,8 @@
         <w:spacing w:after="0" w:before="160"/>
       </w:pPr>
       <w:r>
-        <w:t xml:space="preserve"/>
+        <w:t xml:space="preserve">
+        </w:t>
       </w:r>
     </w:p>
     <w:tbl>
@@ -5349,7 +5385,7 @@
                 <w:sz w:val="22"/>
                 <w:szCs w:val="22"/>
               </w:rPr>
-              <w:t xml:space="preserve">Component-based Payment Engine là phần phức tạp và rủi ro nhất của hệ thống. Cần thiết kế kỹ state diagram và viết unit test đầy đủ cho module này trước khi lập trình. State Machine của vòng đời booking cũng cần được document chi tiết để tránh edge case. Cơ chế so sánh ảnh check-in/check-out nên làm rõ ngay từ đầu: hệ thống hỗ trợ staff review thủ công hay tự động bằng AI.</w:t>
+              <w:t xml:space="preserve">Component-based Payment Engine, Booking/Session State Machine và incident policy resolution là phần rủi ro nhất của Operational Core. Phase 1 cần test kỹ snapshot pricing, payment component lifecycle, slot locking qua booking_vehicles, inspection photos/checklists, F&amp;B/package/subscription/contest flows và trust score logs. Dispute workflow nhiều bên, AI damage detection nâng cao, SaaS tenant model, analytics nâng cao, loyalty và dynamic pricing chuyển sang Phase 2.</w:t>
             </w:r>
           </w:p>
         </w:tc>
@@ -5360,7 +5396,8 @@
         <w:spacing w:after="0" w:before="160"/>
       </w:pPr>
       <w:r>
-        <w:t xml:space="preserve"/>
+        <w:t xml:space="preserve">
+        </w:t>
       </w:r>
     </w:p>
     <w:sectPr>

</xml_diff>